<commit_message>
Met à jour le prompt XML Markdown avec les corrections d'ambiguïtés
Reprend les trois corrections de la nouvelle version Word : parenthèse
orpheline (5.4), point 2 du message de restitution (section 10) et
virgule finale (annexe B2).

Co-Authored-By: Claude Opus 5.5 <noreply@anthropic.com>
Claude-Session: https://claude.ai/code/session_01JbsNLczosUACwE9ekCUCCp
</commit_message>
<xml_diff>
--- a/prompts/Prompt_Audit_DD_Corp_vSL_XML_Markdown.docx
+++ b/prompts/Prompt_Audit_DD_Corp_vSL_XML_Markdown.docx
@@ -1639,7 +1639,7 @@
         <w:spacing w:after="0"/>
       </w:pPr>
       <w:r>
-        <w:t xml:space="preserve">- **Commentaire** : Préciser ce qui manque en cas d’état Communiqué partiellement, Communiqué – non conforme, Communiqué partiellement – non conforme : exercice, société, annexe, daté de plus d’un mois, non à jour, non signé, illisible, etc.)</w:t>
+        <w:t xml:space="preserve">- **Commentaire** : Préciser ce qui manque en cas d’état Communiqué partiellement, Communiqué – non conforme, Communiqué partiellement – non conforme : exercice, société, annexe, daté de plus d’un mois, non à jour, non signé, illisible, etc.</w:t>
       </w:r>
     </w:p>
     <w:p>
@@ -3663,7 +3663,7 @@
         <w:spacing w:after="0"/>
       </w:pPr>
       <w:r>
-        <w:t xml:space="preserve">2. Fichiers produits ou, à défaut, arrête-toi après l'étape 2, société par société.</w:t>
+        <w:t xml:space="preserve">2. Fichiers produits.</w:t>
       </w:r>
     </w:p>
     <w:p>
@@ -4935,7 +4935,7 @@
         <w:spacing w:after="0"/>
       </w:pPr>
       <w:r>
-        <w:t xml:space="preserve">| 8 / 13 | Convention intra-groupe | Animation / Conventions intragroupes ; RL-11, RL-13, |</w:t>
+        <w:t xml:space="preserve">| 8 / 13 | Convention intra-groupe | Animation / Conventions intragroupes ; RL-11, RL-13 |</w:t>
       </w:r>
     </w:p>
     <w:p>

</xml_diff>